<commit_message>
Objetos y sus referencias
</commit_message>
<xml_diff>
--- a/Personajes/Documento del grupo.docx
+++ b/Personajes/Documento del grupo.docx
@@ -146,6 +146,9 @@
         <w:jc w:val="center"/>
       </w:pPr>
       <w:r>
+        <w:rPr>
+          <w:noProof/>
+        </w:rPr>
         <w:drawing>
           <wp:inline distT="0" distB="0" distL="0" distR="0" wp14:anchorId="47A912E5" wp14:editId="650EC766">
             <wp:extent cx="5178787" cy="7200000"/>
@@ -162,7 +165,7 @@
                     <pic:cNvPicPr/>
                   </pic:nvPicPr>
                   <pic:blipFill>
-                    <a:blip r:embed="rId5"/>
+                    <a:blip r:embed="rId7"/>
                     <a:stretch>
                       <a:fillRect/>
                     </a:stretch>
@@ -183,7 +186,153 @@
         </w:drawing>
       </w:r>
     </w:p>
-    <w:p/>
+    <w:p>
+      <w:pPr>
+        <w:pStyle w:val="Subttulo"/>
+      </w:pPr>
+      <w:r>
+        <w:lastRenderedPageBreak/>
+        <w:t>Objetos</w:t>
+      </w:r>
+    </w:p>
+    <w:p>
+      <w:pPr>
+        <w:pStyle w:val="Prrafodelista"/>
+        <w:numPr>
+          <w:ilvl w:val="0"/>
+          <w:numId w:val="2"/>
+        </w:numPr>
+      </w:pPr>
+      <w:r>
+        <w:t>Cámara de fotos (Turistas)</w:t>
+      </w:r>
+    </w:p>
+    <w:p>
+      <w:pPr>
+        <w:pStyle w:val="Prrafodelista"/>
+        <w:numPr>
+          <w:ilvl w:val="0"/>
+          <w:numId w:val="2"/>
+        </w:numPr>
+      </w:pPr>
+      <w:r>
+        <w:t>Mochila (Turistas)</w:t>
+      </w:r>
+    </w:p>
+    <w:p>
+      <w:pPr>
+        <w:pStyle w:val="Prrafodelista"/>
+        <w:numPr>
+          <w:ilvl w:val="0"/>
+          <w:numId w:val="2"/>
+        </w:numPr>
+      </w:pPr>
+      <w:r>
+        <w:t>Rosario (Monja)</w:t>
+      </w:r>
+    </w:p>
+    <w:p>
+      <w:pPr>
+        <w:pStyle w:val="Prrafodelista"/>
+        <w:numPr>
+          <w:ilvl w:val="0"/>
+          <w:numId w:val="2"/>
+        </w:numPr>
+      </w:pPr>
+      <w:r>
+        <w:t>Móvil (turistas</w:t>
+      </w:r>
+      <w:r>
+        <w:t>, peatones, familias</w:t>
+      </w:r>
+      <w:r>
+        <w:t>)</w:t>
+      </w:r>
+    </w:p>
+    <w:p>
+      <w:pPr>
+        <w:pStyle w:val="Prrafodelista"/>
+        <w:numPr>
+          <w:ilvl w:val="0"/>
+          <w:numId w:val="2"/>
+        </w:numPr>
+      </w:pPr>
+      <w:r>
+        <w:t>Biblia (monja)</w:t>
+      </w:r>
+    </w:p>
+    <w:p>
+      <w:pPr>
+        <w:pStyle w:val="Prrafodelista"/>
+        <w:numPr>
+          <w:ilvl w:val="0"/>
+          <w:numId w:val="2"/>
+        </w:numPr>
+      </w:pPr>
+      <w:r>
+        <w:t>Globo (</w:t>
+      </w:r>
+      <w:r>
+        <w:t>familias</w:t>
+      </w:r>
+      <w:r>
+        <w:t>)</w:t>
+      </w:r>
+    </w:p>
+    <w:p>
+      <w:pPr>
+        <w:pStyle w:val="Prrafodelista"/>
+        <w:numPr>
+          <w:ilvl w:val="0"/>
+          <w:numId w:val="2"/>
+        </w:numPr>
+      </w:pPr>
+      <w:r>
+        <w:t xml:space="preserve">Sombrero (turistas y </w:t>
+      </w:r>
+      <w:r>
+        <w:t>peatones</w:t>
+      </w:r>
+      <w:r>
+        <w:t>)</w:t>
+      </w:r>
+    </w:p>
+    <w:p>
+      <w:pPr>
+        <w:pStyle w:val="Prrafodelista"/>
+        <w:numPr>
+          <w:ilvl w:val="0"/>
+          <w:numId w:val="2"/>
+        </w:numPr>
+      </w:pPr>
+      <w:r>
+        <w:t>Tablet (científicos)</w:t>
+      </w:r>
+    </w:p>
+    <w:p>
+      <w:pPr>
+        <w:pStyle w:val="Prrafodelista"/>
+        <w:numPr>
+          <w:ilvl w:val="0"/>
+          <w:numId w:val="2"/>
+        </w:numPr>
+      </w:pPr>
+      <w:r>
+        <w:t>Gafas (para principalmente los científicos)</w:t>
+      </w:r>
+    </w:p>
+    <w:p>
+      <w:pPr>
+        <w:pStyle w:val="Prrafodelista"/>
+        <w:numPr>
+          <w:ilvl w:val="0"/>
+          <w:numId w:val="2"/>
+        </w:numPr>
+      </w:pPr>
+      <w:r>
+        <w:t>Pelota (familias)</w:t>
+      </w:r>
+    </w:p>
     <w:sectPr>
       <w:pgSz w:w="11906" w:h="16838"/>
       <w:pgMar w:top="1417" w:right="1701" w:bottom="1417" w:left="1701" w:header="708" w:footer="708" w:gutter="0"/>
@@ -192,6 +341,56 @@
     </w:sectPr>
   </w:body>
 </w:document>
+</file>
+
+<file path=word/endnotes.xml><?xml version="1.0" encoding="utf-8"?>
+<w:endnotes xmlns:wpc="http://schemas.microsoft.com/office/word/2010/wordprocessingCanvas" xmlns:cx="http://schemas.microsoft.com/office/drawing/2014/chartex" xmlns:cx1="http://schemas.microsoft.com/office/drawing/2015/9/8/chartex" xmlns:cx2="http://schemas.microsoft.com/office/drawing/2015/10/21/chartex" xmlns:cx3="http://schemas.microsoft.com/office/drawing/2016/5/9/chartex" xmlns:cx4="http://schemas.microsoft.com/office/drawing/2016/5/10/chartex" xmlns:cx5="http://schemas.microsoft.com/office/drawing/2016/5/11/chartex" xmlns:cx6="http://schemas.microsoft.com/office/drawing/2016/5/12/chartex" xmlns:cx7="http://schemas.microsoft.com/office/drawing/2016/5/13/chartex" xmlns:cx8="http://schemas.microsoft.com/office/drawing/2016/5/14/chartex" xmlns:mc="http://schemas.openxmlformats.org/markup-compatibility/2006" xmlns:aink="http://schemas.microsoft.com/office/drawing/2016/ink" xmlns:am3d="http://schemas.microsoft.com/office/drawing/2017/model3d" xmlns:o="urn:schemas-microsoft-com:office:office" xmlns:oel="http://schemas.microsoft.com/office/2019/extlst" xmlns:r="http://schemas.openxmlformats.org/officeDocument/2006/relationships" xmlns:m="http://schemas.openxmlformats.org/officeDocument/2006/math" xmlns:v="urn:schemas-microsoft-com:vml" xmlns:wp14="http://schemas.microsoft.com/office/word/2010/wordprocessingDrawing" xmlns:wp="http://schemas.openxmlformats.org/drawingml/2006/wordprocessingDrawing" xmlns:w10="urn:schemas-microsoft-com:office:word" xmlns:w="http://schemas.openxmlformats.org/wordprocessingml/2006/main" xmlns:w14="http://schemas.microsoft.com/office/word/2010/wordml" xmlns:w15="http://schemas.microsoft.com/office/word/2012/wordml" xmlns:w16cex="http://schemas.microsoft.com/office/word/2018/wordml/cex" xmlns:w16cid="http://schemas.microsoft.com/office/word/2016/wordml/cid" xmlns:w16="http://schemas.microsoft.com/office/word/2018/wordml" xmlns:w16du="http://schemas.microsoft.com/office/word/2023/wordml/word16du" xmlns:w16sdtdh="http://schemas.microsoft.com/office/word/2020/wordml/sdtdatahash" xmlns:w16sdtfl="http://schemas.microsoft.com/office/word/2024/wordml/sdtformatlock" xmlns:w16se="http://schemas.microsoft.com/office/word/2015/wordml/symex" xmlns:wpg="http://schemas.microsoft.com/office/word/2010/wordprocessingGroup" xmlns:wpi="http://schemas.microsoft.com/office/word/2010/wordprocessingInk" xmlns:wne="http://schemas.microsoft.com/office/word/2006/wordml" xmlns:wps="http://schemas.microsoft.com/office/word/2010/wordprocessingShape" mc:Ignorable="w14 w15 w16se w16cid w16 w16cex w16sdtdh w16sdtfl w16du wp14">
+  <w:endnote w:type="separator" w:id="-1">
+    <w:p>
+      <w:pPr>
+        <w:spacing w:after="0" w:line="240" w:lineRule="auto"/>
+      </w:pPr>
+      <w:r>
+        <w:separator/>
+      </w:r>
+    </w:p>
+  </w:endnote>
+  <w:endnote w:type="continuationSeparator" w:id="0">
+    <w:p>
+      <w:pPr>
+        <w:spacing w:after="0" w:line="240" w:lineRule="auto"/>
+      </w:pPr>
+      <w:r>
+        <w:continuationSeparator/>
+      </w:r>
+    </w:p>
+  </w:endnote>
+</w:endnotes>
+</file>
+
+<file path=word/footnotes.xml><?xml version="1.0" encoding="utf-8"?>
+<w:footnotes xmlns:wpc="http://schemas.microsoft.com/office/word/2010/wordprocessingCanvas" xmlns:cx="http://schemas.microsoft.com/office/drawing/2014/chartex" xmlns:cx1="http://schemas.microsoft.com/office/drawing/2015/9/8/chartex" xmlns:cx2="http://schemas.microsoft.com/office/drawing/2015/10/21/chartex" xmlns:cx3="http://schemas.microsoft.com/office/drawing/2016/5/9/chartex" xmlns:cx4="http://schemas.microsoft.com/office/drawing/2016/5/10/chartex" xmlns:cx5="http://schemas.microsoft.com/office/drawing/2016/5/11/chartex" xmlns:cx6="http://schemas.microsoft.com/office/drawing/2016/5/12/chartex" xmlns:cx7="http://schemas.microsoft.com/office/drawing/2016/5/13/chartex" xmlns:cx8="http://schemas.microsoft.com/office/drawing/2016/5/14/chartex" xmlns:mc="http://schemas.openxmlformats.org/markup-compatibility/2006" xmlns:aink="http://schemas.microsoft.com/office/drawing/2016/ink" xmlns:am3d="http://schemas.microsoft.com/office/drawing/2017/model3d" xmlns:o="urn:schemas-microsoft-com:office:office" xmlns:oel="http://schemas.microsoft.com/office/2019/extlst" xmlns:r="http://schemas.openxmlformats.org/officeDocument/2006/relationships" xmlns:m="http://schemas.openxmlformats.org/officeDocument/2006/math" xmlns:v="urn:schemas-microsoft-com:vml" xmlns:wp14="http://schemas.microsoft.com/office/word/2010/wordprocessingDrawing" xmlns:wp="http://schemas.openxmlformats.org/drawingml/2006/wordprocessingDrawing" xmlns:w10="urn:schemas-microsoft-com:office:word" xmlns:w="http://schemas.openxmlformats.org/wordprocessingml/2006/main" xmlns:w14="http://schemas.microsoft.com/office/word/2010/wordml" xmlns:w15="http://schemas.microsoft.com/office/word/2012/wordml" xmlns:w16cex="http://schemas.microsoft.com/office/word/2018/wordml/cex" xmlns:w16cid="http://schemas.microsoft.com/office/word/2016/wordml/cid" xmlns:w16="http://schemas.microsoft.com/office/word/2018/wordml" xmlns:w16du="http://schemas.microsoft.com/office/word/2023/wordml/word16du" xmlns:w16sdtdh="http://schemas.microsoft.com/office/word/2020/wordml/sdtdatahash" xmlns:w16sdtfl="http://schemas.microsoft.com/office/word/2024/wordml/sdtformatlock" xmlns:w16se="http://schemas.microsoft.com/office/word/2015/wordml/symex" xmlns:wpg="http://schemas.microsoft.com/office/word/2010/wordprocessingGroup" xmlns:wpi="http://schemas.microsoft.com/office/word/2010/wordprocessingInk" xmlns:wne="http://schemas.microsoft.com/office/word/2006/wordml" xmlns:wps="http://schemas.microsoft.com/office/word/2010/wordprocessingShape" mc:Ignorable="w14 w15 w16se w16cid w16 w16cex w16sdtdh w16sdtfl w16du wp14">
+  <w:footnote w:type="separator" w:id="-1">
+    <w:p>
+      <w:pPr>
+        <w:spacing w:after="0" w:line="240" w:lineRule="auto"/>
+      </w:pPr>
+      <w:r>
+        <w:separator/>
+      </w:r>
+    </w:p>
+  </w:footnote>
+  <w:footnote w:type="continuationSeparator" w:id="0">
+    <w:p>
+      <w:pPr>
+        <w:spacing w:after="0" w:line="240" w:lineRule="auto"/>
+      </w:pPr>
+      <w:r>
+        <w:continuationSeparator/>
+      </w:r>
+    </w:p>
+  </w:footnote>
+</w:footnotes>
 </file>
 
 <file path=word/numbering.xml><?xml version="1.0" encoding="utf-8"?>
@@ -309,8 +508,123 @@
       </w:rPr>
     </w:lvl>
   </w:abstractNum>
+  <w:abstractNum w:abstractNumId="1" w15:restartNumberingAfterBreak="0">
+    <w:nsid w:val="2ABC2987"/>
+    <w:multiLevelType w:val="hybridMultilevel"/>
+    <w:tmpl w:val="A3405880"/>
+    <w:lvl w:ilvl="0" w:tplc="D1D8E054">
+      <w:numFmt w:val="bullet"/>
+      <w:lvlText w:val="-"/>
+      <w:lvlJc w:val="left"/>
+      <w:pPr>
+        <w:ind w:left="720" w:hanging="360"/>
+      </w:pPr>
+      <w:rPr>
+        <w:rFonts w:ascii="Aptos" w:eastAsiaTheme="minorHAnsi" w:hAnsi="Aptos" w:cstheme="minorBidi" w:hint="default"/>
+      </w:rPr>
+    </w:lvl>
+    <w:lvl w:ilvl="1" w:tplc="0C0A0003" w:tentative="1">
+      <w:start w:val="1"/>
+      <w:numFmt w:val="bullet"/>
+      <w:lvlText w:val="o"/>
+      <w:lvlJc w:val="left"/>
+      <w:pPr>
+        <w:ind w:left="1440" w:hanging="360"/>
+      </w:pPr>
+      <w:rPr>
+        <w:rFonts w:ascii="Courier New" w:hAnsi="Courier New" w:cs="Courier New" w:hint="default"/>
+      </w:rPr>
+    </w:lvl>
+    <w:lvl w:ilvl="2" w:tplc="0C0A0005" w:tentative="1">
+      <w:start w:val="1"/>
+      <w:numFmt w:val="bullet"/>
+      <w:lvlText w:val=""/>
+      <w:lvlJc w:val="left"/>
+      <w:pPr>
+        <w:ind w:left="2160" w:hanging="360"/>
+      </w:pPr>
+      <w:rPr>
+        <w:rFonts w:ascii="Wingdings" w:hAnsi="Wingdings" w:hint="default"/>
+      </w:rPr>
+    </w:lvl>
+    <w:lvl w:ilvl="3" w:tplc="0C0A0001" w:tentative="1">
+      <w:start w:val="1"/>
+      <w:numFmt w:val="bullet"/>
+      <w:lvlText w:val=""/>
+      <w:lvlJc w:val="left"/>
+      <w:pPr>
+        <w:ind w:left="2880" w:hanging="360"/>
+      </w:pPr>
+      <w:rPr>
+        <w:rFonts w:ascii="Symbol" w:hAnsi="Symbol" w:hint="default"/>
+      </w:rPr>
+    </w:lvl>
+    <w:lvl w:ilvl="4" w:tplc="0C0A0003" w:tentative="1">
+      <w:start w:val="1"/>
+      <w:numFmt w:val="bullet"/>
+      <w:lvlText w:val="o"/>
+      <w:lvlJc w:val="left"/>
+      <w:pPr>
+        <w:ind w:left="3600" w:hanging="360"/>
+      </w:pPr>
+      <w:rPr>
+        <w:rFonts w:ascii="Courier New" w:hAnsi="Courier New" w:cs="Courier New" w:hint="default"/>
+      </w:rPr>
+    </w:lvl>
+    <w:lvl w:ilvl="5" w:tplc="0C0A0005" w:tentative="1">
+      <w:start w:val="1"/>
+      <w:numFmt w:val="bullet"/>
+      <w:lvlText w:val=""/>
+      <w:lvlJc w:val="left"/>
+      <w:pPr>
+        <w:ind w:left="4320" w:hanging="360"/>
+      </w:pPr>
+      <w:rPr>
+        <w:rFonts w:ascii="Wingdings" w:hAnsi="Wingdings" w:hint="default"/>
+      </w:rPr>
+    </w:lvl>
+    <w:lvl w:ilvl="6" w:tplc="0C0A0001" w:tentative="1">
+      <w:start w:val="1"/>
+      <w:numFmt w:val="bullet"/>
+      <w:lvlText w:val=""/>
+      <w:lvlJc w:val="left"/>
+      <w:pPr>
+        <w:ind w:left="5040" w:hanging="360"/>
+      </w:pPr>
+      <w:rPr>
+        <w:rFonts w:ascii="Symbol" w:hAnsi="Symbol" w:hint="default"/>
+      </w:rPr>
+    </w:lvl>
+    <w:lvl w:ilvl="7" w:tplc="0C0A0003" w:tentative="1">
+      <w:start w:val="1"/>
+      <w:numFmt w:val="bullet"/>
+      <w:lvlText w:val="o"/>
+      <w:lvlJc w:val="left"/>
+      <w:pPr>
+        <w:ind w:left="5760" w:hanging="360"/>
+      </w:pPr>
+      <w:rPr>
+        <w:rFonts w:ascii="Courier New" w:hAnsi="Courier New" w:cs="Courier New" w:hint="default"/>
+      </w:rPr>
+    </w:lvl>
+    <w:lvl w:ilvl="8" w:tplc="0C0A0005" w:tentative="1">
+      <w:start w:val="1"/>
+      <w:numFmt w:val="bullet"/>
+      <w:lvlText w:val=""/>
+      <w:lvlJc w:val="left"/>
+      <w:pPr>
+        <w:ind w:left="6480" w:hanging="360"/>
+      </w:pPr>
+      <w:rPr>
+        <w:rFonts w:ascii="Wingdings" w:hAnsi="Wingdings" w:hint="default"/>
+      </w:rPr>
+    </w:lvl>
+  </w:abstractNum>
   <w:num w:numId="1" w16cid:durableId="1348412825">
     <w:abstractNumId w:val="0"/>
+  </w:num>
+  <w:num w:numId="2" w16cid:durableId="601885071">
+    <w:abstractNumId w:val="1"/>
   </w:num>
 </w:numbering>
 </file>
@@ -1232,6 +1546,50 @@
       <w:spacing w:val="5"/>
     </w:rPr>
   </w:style>
+  <w:style w:type="paragraph" w:styleId="Encabezado">
+    <w:name w:val="header"/>
+    <w:basedOn w:val="Normal"/>
+    <w:link w:val="EncabezadoCar"/>
+    <w:uiPriority w:val="99"/>
+    <w:unhideWhenUsed/>
+    <w:rsid w:val="005D256E"/>
+    <w:pPr>
+      <w:tabs>
+        <w:tab w:val="center" w:pos="4252"/>
+        <w:tab w:val="right" w:pos="8504"/>
+      </w:tabs>
+      <w:spacing w:after="0" w:line="240" w:lineRule="auto"/>
+    </w:pPr>
+  </w:style>
+  <w:style w:type="character" w:customStyle="1" w:styleId="EncabezadoCar">
+    <w:name w:val="Encabezado Car"/>
+    <w:basedOn w:val="Fuentedeprrafopredeter"/>
+    <w:link w:val="Encabezado"/>
+    <w:uiPriority w:val="99"/>
+    <w:rsid w:val="005D256E"/>
+  </w:style>
+  <w:style w:type="paragraph" w:styleId="Piedepgina">
+    <w:name w:val="footer"/>
+    <w:basedOn w:val="Normal"/>
+    <w:link w:val="PiedepginaCar"/>
+    <w:uiPriority w:val="99"/>
+    <w:unhideWhenUsed/>
+    <w:rsid w:val="005D256E"/>
+    <w:pPr>
+      <w:tabs>
+        <w:tab w:val="center" w:pos="4252"/>
+        <w:tab w:val="right" w:pos="8504"/>
+      </w:tabs>
+      <w:spacing w:after="0" w:line="240" w:lineRule="auto"/>
+    </w:pPr>
+  </w:style>
+  <w:style w:type="character" w:customStyle="1" w:styleId="PiedepginaCar">
+    <w:name w:val="Pie de página Car"/>
+    <w:basedOn w:val="Fuentedeprrafopredeter"/>
+    <w:link w:val="Piedepgina"/>
+    <w:uiPriority w:val="99"/>
+    <w:rsid w:val="005D256E"/>
+  </w:style>
 </w:styles>
 </file>
 

</xml_diff>

<commit_message>
Reorganización y adición de imágenes
</commit_message>
<xml_diff>
--- a/Personajes/Documento del grupo.docx
+++ b/Personajes/Documento del grupo.docx
@@ -319,6 +319,18 @@
       </w:pPr>
       <w:r>
         <w:t>Gafas (para principalmente los científicos)</w:t>
+      </w:r>
+    </w:p>
+    <w:p>
+      <w:pPr>
+        <w:pStyle w:val="Prrafodelista"/>
+        <w:numPr>
+          <w:ilvl w:val="0"/>
+          <w:numId w:val="2"/>
+        </w:numPr>
+      </w:pPr>
+      <w:r>
+        <w:t>Gafas para eclipses (para todos)</w:t>
       </w:r>
     </w:p>
     <w:p>

</xml_diff>